<commit_message>
Address pre-submission review concerns; rebuild on official Diagnostics template
- Reconcile study flow: separate 11 unretrieved reports from 11 included
  reports assessed from limited primary material (Figure 1, Table S3)
- Signalling-question PROBAST+AI audit for all 47 evaluations (Table S8)
  with study-specific justifications (Table S7)
- Line-by-line search strategies with interfaces (Table S1)
- Representative-estimate selection table and sensitivity analyses
  (Table S6, Table 3); Figure 2 shows uncertainty and source access
- Distinguish independent-cohort evaluation, pipeline replication and
  target-sample updating; applicability judged against intended-use
  populations (Table S9, Figure 3C)
- Calibrated conclusions; readiness table with explicit status rules
- Remove superseded notes and build scripts

Co-Authored-By: Claude Opus 5.5 <noreply@anthropic.com>
Claude-Session: https://claude.ai/code/session_01EaCCrfmcWvY5Pa6zJB39mC
</commit_message>
<xml_diff>
--- a/submission_diagnostics/Cover_Letter_Diagnostics.docx
+++ b/submission_diagnostics/Cover_Letter_Diagnostics.docx
@@ -142,7 +142,7 @@
         <w:spacing w:after="60"/>
       </w:pPr>
       <w:r>
-        <w:t>Scope and rigour. We synthesized 47 reports from 37 independent cohort families, restricting evidence to strictly prospective, individualized fall prediction and grouping overlapping publications from the same cohorts so that the evidence base is not overstated. The protocol was registered in PROSPERO (CRD420261502037), and reporting follows PRISMA 2020 and TRIPOD-SRMA.</w:t>
+        <w:t>Scope and rigour. We synthesized 47 reports from 37 independent cohort families, restricting evidence to strictly prospective, individualized fall prediction and grouping overlapping publications so that the evidence base is not overstated. The protocol was registered in PROSPERO before searching (CRD420261502037), and reporting follows PRISMA 2020 and TRIPOD-SRMA.</w:t>
       </w:r>
     </w:p>
     <w:p>
@@ -151,7 +151,7 @@
         <w:spacing w:after="60"/>
       </w:pPr>
       <w:r>
-        <w:t>First application of PROBAST+AI to this field. We appraised every development and evaluation with the 2025 PROBAST+AI tool, which was designed for both regression and machine-learning models.</w:t>
+        <w:t>Transparent, auditable appraisal. Every development and evaluation was appraised with the 2025 PROBAST+AI tool; the decisive analysis-domain signalling questions, every representative-estimate selection, and applicability against each model’s intended-use population are documented study by study in the Supplementary Materials, and all summaries are tested in sensitivity analyses.</w:t>
       </w:r>
     </w:p>
     <w:p>
@@ -160,7 +160,7 @@
         <w:spacing w:after="60"/>
       </w:pPr>
       <w:r>
-        <w:t>A clear, clinically relevant message. Discrimination falls steeply as evaluation becomes more rigorous: the median representative AUC was 0.76, the highest values came from small samples evaluated in their own development data, and the only independent external validation produced AUCs of 0.49–0.59. Calibration was reported by one study, clinical utility by none, and all 47 evaluations were at high risk of bias.</w:t>
+        <w:t>A clear, appropriately cautious message. The median representative AUC was 0.76, mainly from development and internal-validation samples; the only independent-cohort evaluation of published models found AUCs of 0.49–0.59; calibration intercept and slope were reported once; and all 47 evaluations were at high risk of bias. The evidence therefore does not yet establish readiness for routine clinical use.</w:t>
       </w:r>
     </w:p>
     <w:p>
@@ -169,7 +169,7 @@
         <w:spacing w:after="60"/>
       </w:pPr>
       <w:r>
-        <w:t>Actionable output. A clinical-readiness scorecard (Table 4) and a set of minimum standards for future studies (Table 5) give developers, reviewers, and regulators concrete criteria for moving digital gait biomarkers from promising signal to validated diagnostic tool.</w:t>
+        <w:t>Actionable output. A readiness table with explicit rules (Table 4) and minimum standards for future studies (Table 5) give developers, reviewers, and regulators concrete criteria for moving digital gait biomarkers towards validated diagnostic tools.</w:t>
       </w:r>
     </w:p>
     <w:p>
@@ -193,7 +193,7 @@
           <w:b w:val="0"/>
           <w:i w:val="0"/>
         </w:rPr>
-        <w:t>Declarations. This manuscript is original, has not been published previously, and is not under consideration by any other journal. All authors have approved the submitted version and agree with its submission to Diagnostics. The review used published data only, so ethics approval was not required. The work was funded by the King Salman Center for Disability Research (KSRG-2026-455); the funder had no role in the study. The authors declare no conflicts of interest. The PRISMA 2020 checklist and Supplementary Tables S1–S6 are provided with the submission.</w:t>
+        <w:t>Declarations. This manuscript is original, has not been published previously, and is not under consideration by any other journal. All authors have approved the submitted version and agree with its submission to Diagnostics. The review used published data only, so ethics approval was not required. The work was funded by the King Salman Center for Disability Research (KSRG-2026-455); the funder had no role in the study. The authors declare no conflicts of interest. The PRISMA 2020 checklist and Supplementary Tables S1–S9 are provided with the submission.</w:t>
       </w:r>
     </w:p>
     <w:p>

</xml_diff>

<commit_message>
Resolve remaining appraisal and reporting concerns
- Remove locally formulated checklist table; report PROBAST+AI domain
  judgments with study-specific reasons, precision and DOIs (Table S7)
- Replace fixed 100-faller rule with Hanley-McNeil precision assessment;
  limited-access reports rated only on verifiable features (45 high,
  2 unclear evaluations)
- Remove unverifiable claims (registration timing, detailed mobility
  search); strategies reported as recorded
- Correct calibration counts, 'potentially optimistic' wording, and
  cover-letter description of the included tools

Co-Authored-By: Claude Opus 5.5 <noreply@anthropic.com>
Claude-Session: https://claude.ai/code/session_01EaCCrfmcWvY5Pa6zJB39mC
</commit_message>
<xml_diff>
--- a/submission_diagnostics/Cover_Letter_Diagnostics.docx
+++ b/submission_diagnostics/Cover_Letter_Diagnostics.docx
@@ -142,7 +142,7 @@
         <w:spacing w:after="60"/>
       </w:pPr>
       <w:r>
-        <w:t>Scope and rigour. We synthesized 47 reports from 37 independent cohort families, restricting evidence to strictly prospective, individualized fall prediction and grouping overlapping publications so that the evidence base is not overstated. The protocol was registered in PROSPERO before searching (CRD420261502037), and reporting follows PRISMA 2020 and TRIPOD-SRMA.</w:t>
+        <w:t>Scope and rigour. We synthesized 47 reports from 37 independent cohort families, restricting evidence to strictly prospective, individualized fall prediction and grouping overlapping publications so that the evidence base is not overstated. The protocol was registered in PROSPERO (CRD420261502037), and reporting follows PRISMA 2020 and TRIPOD-SRMA.</w:t>
       </w:r>
     </w:p>
     <w:p>
@@ -151,7 +151,7 @@
         <w:spacing w:after="60"/>
       </w:pPr>
       <w:r>
-        <w:t>Transparent, auditable appraisal. Every development and evaluation was appraised with the 2025 PROBAST+AI tool; the decisive analysis-domain signalling questions, every representative-estimate selection, and applicability against each model’s intended-use population are documented study by study in the Supplementary Materials, and all summaries are tested in sensitivity analyses.</w:t>
+        <w:t>Transparent appraisal. Every development and evaluation was appraised with the 2025 PROBAST+AI tool, with study-specific reasons and a precision-based assessment of sample size; every representative-estimate selection and applicability judgment is documented, and all summaries are tested in sensitivity analyses.</w:t>
       </w:r>
     </w:p>
     <w:p>
@@ -160,7 +160,7 @@
         <w:spacing w:after="60"/>
       </w:pPr>
       <w:r>
-        <w:t>A clear, appropriately cautious message. The median representative AUC was 0.76, mainly from development and internal-validation samples; the only independent-cohort evaluation of published models found AUCs of 0.49–0.59; calibration intercept and slope were reported once; and all 47 evaluations were at high risk of bias. The evidence therefore does not yet establish readiness for routine clinical use.</w:t>
+        <w:t>A clear, appropriately cautious message. The median representative AUC was 0.76, mainly from development and internal-validation samples; the only independent-cohort evaluation of published models found AUCs of 0.49–0.59; calibration intercept and slope were reported once; and 45 of 47 evaluations were at high risk of bias, with none at low risk. The evidence therefore does not yet establish readiness for routine clinical use.</w:t>
       </w:r>
     </w:p>
     <w:p>
@@ -169,7 +169,7 @@
         <w:spacing w:after="60"/>
       </w:pPr>
       <w:r>
-        <w:t>Actionable output. A readiness table with explicit rules (Table 4) and minimum standards for future studies (Table 5) give developers, reviewers, and regulators concrete criteria for moving digital gait biomarkers towards validated diagnostic tools.</w:t>
+        <w:t>Actionable output. A readiness table with explicit rules (Table 4) and minimum standards for future studies (Table 5) give developers, reviewers, and regulators concrete criteria for moving digital gait biomarkers towards validated prognostic tools.</w:t>
       </w:r>
     </w:p>
     <w:p>
@@ -181,7 +181,7 @@
           <w:b w:val="0"/>
           <w:i w:val="0"/>
         </w:rPr>
-        <w:t>Fit with the Special Issue. The manuscript addresses the clinical validation of AI algorithms applied to wearable-sensor and ambient-vision data for continuous risk monitoring, which is central to the aims of the Special Issue, and it provides a methodological benchmark for future submissions in this area.</w:t>
+        <w:t>Fit with the Special Issue. The review evaluates prognostic tools that apply statistical and machine-learning models to data from wearable sensors and ambient vision systems. Most included studies used brief structured gait assessments, and a smaller number used free-living or continuous monitoring; the review therefore speaks directly to the validation standards that wearable-sensor and artificial-intelligence tools must meet before they are used for disease-risk monitoring in older adults.</w:t>
       </w:r>
     </w:p>
     <w:p>
@@ -193,7 +193,7 @@
           <w:b w:val="0"/>
           <w:i w:val="0"/>
         </w:rPr>
-        <w:t>Declarations. This manuscript is original, has not been published previously, and is not under consideration by any other journal. All authors have approved the submitted version and agree with its submission to Diagnostics. The review used published data only, so ethics approval was not required. The work was funded by the King Salman Center for Disability Research (KSRG-2026-455); the funder had no role in the study. The authors declare no conflicts of interest. The PRISMA 2020 checklist and Supplementary Tables S1–S9 are provided with the submission.</w:t>
+        <w:t>Declarations. This manuscript is original, has not been published previously, and is not under consideration by any other journal. All authors have approved the submitted version and agree with its submission to Diagnostics. The review used published data only, so ethics approval was not required. The work was funded by the King Salman Center for Disability Research (KSRG-2026-455); the funder had no role in the study. The authors declare no conflicts of interest. The PRISMA 2020 checklist and Supplementary Tables S1–S8 are provided with the submission.</w:t>
       </w:r>
     </w:p>
     <w:p>

</xml_diff>

<commit_message>
Finalize submission files from team revision
- Structured abstract per Diagnostics template
- Renumber citations by first appearance; drop uncited reference;
  remap supplement citations
- Regenerate Figures 1-3 in consistent publication style
- Caption label formatting; consolidate repeated disclosures
- Update cover letter to revised title and results

Co-Authored-By: Claude Opus 5.5 <noreply@anthropic.com>
Claude-Session: https://claude.ai/code/session_01EaCCrfmcWvY5Pa6zJB39mC
</commit_message>
<xml_diff>
--- a/submission_diagnostics/Cover_Letter_Diagnostics.docx
+++ b/submission_diagnostics/Cover_Letter_Diagnostics.docx
@@ -97,7 +97,7 @@
         <w:rPr>
           <w:i/>
         </w:rPr>
-        <w:t>Are Digital Gait Biomarkers Ready to Predict Falls? A Systematic Review and PROBAST+AI Appraisal of Wearable and Vision-Based Prognostic Models in Older Adults</w:t>
+        <w:t>Are Digital Gait Biomarkers Ready to Predict Falls? A Systematic Review of Wearable- and Vision-Based Prognostic Models in Older Adults</w:t>
       </w:r>
       <w:r>
         <w:t xml:space="preserve">” for consideration as a Systematic Review in </w:t>
@@ -142,7 +142,7 @@
         <w:spacing w:after="60"/>
       </w:pPr>
       <w:r>
-        <w:t>Scope and rigour. We synthesized 47 reports from 37 independent cohort families, restricting evidence to strictly prospective, individualized fall prediction and grouping overlapping publications so that the evidence base is not overstated. The protocol was registered in PROSPERO (CRD420261502037), and reporting follows PRISMA 2020 and TRIPOD-SRMA.</w:t>
+        <w:t>Scope and rigour. We synthesized 47 reports from 37 independent cohort families, restricting evidence to strictly prospective, individualized fall prediction and grouping overlapping publications so that the evidence base is not overstated. The review is registered in PROSPERO (CRD420261502037), and reporting follows PRISMA 2020 and TRIPOD-SRMA.</w:t>
       </w:r>
     </w:p>
     <w:p>
@@ -151,7 +151,7 @@
         <w:spacing w:after="60"/>
       </w:pPr>
       <w:r>
-        <w:t>Transparent appraisal. Every development and evaluation was appraised with the 2025 PROBAST+AI tool, with study-specific reasons and a precision-based assessment of sample size; every representative-estimate selection and applicability judgment is documented, and all summaries are tested in sensitivity analyses.</w:t>
+        <w:t>Transparent appraisal. Every development and evaluation was appraised at domain level with PROBAST+AI, with report-specific rationales; every representative-estimate selection and applicability judgment is documented, and all summaries are tested in sensitivity analyses.</w:t>
       </w:r>
     </w:p>
     <w:p>
@@ -160,7 +160,7 @@
         <w:spacing w:after="60"/>
       </w:pPr>
       <w:r>
-        <w:t>A clear, appropriately cautious message. The median representative AUC was 0.76, mainly from development and internal-validation samples; the only independent-cohort evaluation of published models found AUCs of 0.49–0.59; calibration intercept and slope were reported once; and 45 of 47 evaluations were at high risk of bias, with none at low risk. The evidence therefore does not yet establish readiness for routine clinical use.</w:t>
+        <w:t>A clear, appropriately cautious message. The median representative AUC was 0.760, largely from development and internal-validation samples; the only independent-cohort evaluation of published models found AUCs of 0.49–0.59; calibration intercept and slope were reported once; and 46 of 47 evaluations were at high risk of bias, with none at low risk. The evidence therefore does not yet establish readiness for routine clinical use.</w:t>
       </w:r>
     </w:p>
     <w:p>
@@ -193,7 +193,7 @@
           <w:b w:val="0"/>
           <w:i w:val="0"/>
         </w:rPr>
-        <w:t>Declarations. This manuscript is original, has not been published previously, and is not under consideration by any other journal. All authors have approved the submitted version and agree with its submission to Diagnostics. The review used published data only, so ethics approval was not required. The work was funded by the King Salman Center for Disability Research (KSRG-2026-455); the funder had no role in the study. The authors declare no conflicts of interest. The PRISMA 2020 checklist and Supplementary Tables S1–S8 are provided with the submission.</w:t>
+        <w:t>Declarations. This manuscript is original, has not been published previously, and is not under consideration by any other journal. All authors have approved the submitted version and agree with its submission to Diagnostics. The review used published data only, so ethics approval was not required. The work was funded by the King Salman Center for Disability Research (KSRG-2026-455); the funder had no role in the study. The authors declare no conflicts of interest. The PRISMA 2020 checklist and Supplementary Tables S1–S7 are provided with the submission.</w:t>
       </w:r>
     </w:p>
     <w:p>

</xml_diff>